<commit_message>
esto es el archivo de vs code html
</commit_message>
<xml_diff>
--- a/Git hub.docx
+++ b/Git hub.docx
@@ -29,66 +29,6 @@
         <w:t>hub</w:t>
       </w:r>
       <w:proofErr w:type="spellEnd"/>
-    </w:p>
-    <w:p>
-      <w:pPr>
-        <w:rPr>
-          <w:sz w:val="40"/>
-          <w:szCs w:val="40"/>
-          <w:lang w:val="es-MX"/>
-        </w:rPr>
-      </w:pPr>
-      <w:proofErr w:type="gramStart"/>
-      <w:r>
-        <w:rPr>
-          <w:sz w:val="40"/>
-          <w:szCs w:val="40"/>
-          <w:lang w:val="es-MX"/>
-        </w:rPr>
-        <w:t>QUE ES GIT HUB?</w:t>
-      </w:r>
-      <w:proofErr w:type="gramEnd"/>
-    </w:p>
-    <w:p>
-      <w:pPr>
-        <w:rPr>
-          <w:sz w:val="36"/>
-          <w:szCs w:val="36"/>
-          <w:lang w:val="es-MX"/>
-        </w:rPr>
-      </w:pPr>
-      <w:r>
-        <w:rPr>
-          <w:b/>
-          <w:bCs/>
-          <w:sz w:val="36"/>
-          <w:szCs w:val="36"/>
-        </w:rPr>
-        <w:t>GitHub es una plataforma en la nube que permite almacenar, gestionar y compartir código fuente de proyectos de software.</w:t>
-      </w:r>
-      <w:r>
-        <w:rPr>
-          <w:sz w:val="36"/>
-          <w:szCs w:val="36"/>
-        </w:rPr>
-        <w:t xml:space="preserve"> Funciona principalmente como un servicio de alojamiento para </w:t>
-      </w:r>
-      <w:r>
-        <w:rPr>
-          <w:b/>
-          <w:bCs/>
-          <w:sz w:val="36"/>
-          <w:szCs w:val="36"/>
-        </w:rPr>
-        <w:t>Git</w:t>
-      </w:r>
-      <w:r>
-        <w:rPr>
-          <w:sz w:val="36"/>
-          <w:szCs w:val="36"/>
-        </w:rPr>
-        <w:t>, un sistema de control de versiones que registra cada cambio realizado en los archivos de un proyecto</w:t>
-      </w:r>
     </w:p>
     <w:sectPr>
       <w:pgSz w:w="11906" w:h="16838"/>
@@ -703,6 +643,7 @@
   <w:style w:type="character" w:default="1" w:styleId="Fuentedeprrafopredeter">
     <w:name w:val="Default Paragraph Font"/>
     <w:uiPriority w:val="1"/>
+    <w:semiHidden/>
     <w:unhideWhenUsed/>
   </w:style>
   <w:style w:type="table" w:default="1" w:styleId="Tablanormal">

</xml_diff>